<commit_message>
Revise H2b wording to allow fixed-cadence hazard
Co-Authored-By: Claude Sonnet 5.5 <noreply@anthropic.com>
Claude-Session: https://claude.ai/code/session_01918kfW6M5XSc3gvpMMKDS3
</commit_message>
<xml_diff>
--- a/paper_data/Manuscript_IEP_revised.docx
+++ b/paper_data/Manuscript_IEP_revised.docx
@@ -881,7 +881,7 @@
         <w:t xml:space="preserve">H2b (time dependence).</w:t>
       </w:r>
       <w:r>
-        <w:t xml:space="preserve"> Within a repository, the release hazard is flat in the time since the last release, apart from a hot-fix spike just after a release.</w:t>
+        <w:t xml:space="preserve"> Within a repository, the release hazard is unrelated to the error state. Apart from a hot-fix spike just after a release, it is flat in the time since the last release (the Calvo form) or rises only because releases follow a fixed cadence (the Taylor form), and in neither case does it accompany a rising error rate.</w:t>
       </w:r>
     </w:p>
     <w:p>
@@ -5271,7 +5271,7 @@
         <w:t xml:space="preserve">Release hazard (RQ2).</w:t>
       </w:r>
       <w:r>
-        <w:t xml:space="preserve"> We treat each repository-week as a period at risk and fit discrete-time logit hazard models of a release in a given week on the weeks since the last release, capping age at eight weeks (Jenkins 1995). Under H2a the slope is positive. Under H2b it is zero once the week immediately after a release is set aside.</w:t>
+        <w:t xml:space="preserve"> We treat each repository-week as a period at risk and fit discrete-time logit hazard models of a release in a given week on the weeks since the last release, capping age at eight weeks (Jenkins 1995). Under H2a the slope is positive. Under H2b it is zero once the week immediately after a release is set aside, or, if releases follow a fixed cadence, positive for regular releases measured from the last regular release. A positive slope alone therefore does not separate H2a from H2b, and RQ2 is read together with RQ1.</w:t>
       </w:r>
     </w:p>
     <w:p>

</xml_diff>

<commit_message>
Replace classification-validation placeholder with limitation text
Co-Authored-By: Claude Sonnet 5.5 <noreply@anthropic.com>
Claude-Session: https://claude.ai/code/session_01918kfW6M5XSc3gvpMMKDS3
</commit_message>
<xml_diff>
--- a/paper_data/Manuscript_IEP_revised.docx
+++ b/paper_data/Manuscript_IEP_revised.docx
@@ -5573,10 +5573,7 @@
         <w:t xml:space="preserve"> A release is a proxy for a refresh, and the repositories are software and tooling rather than model-retraining pipelines, so the timing we observe is not the decision the model describes in its purest form. Bug reports measure what users choose to report, which depends on popularity and on attention around a release, and our offset and trend controls address this only in part. The bug definition combines labels and keywords and may misclassify issues. </w:t>
       </w:r>
       <w:r>
-        <w:rPr>
-          <w:highlight w:val="yellow"/>
-        </w:rPr>
-        <w:t xml:space="preserve">[TO ADD: precision and recall of the bug classification on a manually labeled sample.]</w:t>
+        <w:t xml:space="preserve">We did not validate the classification against a manually labeled sample, so misclassification remains a limitation. It would bias the slope on age only if the share of misclassified issues itself changed with the time since the last release. The bias is limited by the fact that we also report the specification without the issue-volume offset, which does not rely on the share of issues classified as bugs being constant, and by the fact that the pooled slope is estimated within repositories, where the labeling conventions and keyword usage are stable.</w:t>
       </w:r>
     </w:p>
     <w:p>

</xml_diff>

<commit_message>
Remove placeholder data availability statement
Co-Authored-By: Claude Sonnet 5.5 <noreply@anthropic.com>
Claude-Session: https://claude.ai/code/session_01918kfW6M5XSc3gvpMMKDS3
</commit_message>
<xml_diff>
--- a/paper_data/Manuscript_IEP_revised.docx
+++ b/paper_data/Manuscript_IEP_revised.docx
@@ -5635,31 +5635,6 @@
       </w:pPr>
       <w:r>
         <w:t xml:space="preserve">We asked whether release timing in the open-source LLM ecosystem follows a state-dependent rule, in which accumulating degradation triggers a refresh, or a time-dependent rule, in which it does not. In 19 repositories, bug reports do not rise with the age of a release once total issue volume is controlled, and the release hazard rises significantly with age in only one of them. The decline in the raw pooled hazard reflects hot-fixes and differences in release frequency, as in price-change data, and regular releases follow a steady cadence. Release timing in this ecosystem is time-dependent. The finding implies that release cadence should not be read as evidence that degradation is managed, and that detecting and correcting degradation requires performance data that public repositories do not contain. We hope that the replication package helps others with better-instrumented data, such as operators’ own error logs and refresh histories, to test whether the maintenance of deployed AI systems is state-dependent.</w:t>
-      </w:r>
-    </w:p>
-    <w:p>
-      <w:pPr>
-        <w:pStyle w:val="Heading2"/>
-      </w:pPr>
-      <w:r>
-        <w:t xml:space="preserve">Data availability</w:t>
-      </w:r>
-    </w:p>
-    <w:p>
-      <w:pPr>
-        <w:pStyle w:val="FirstParagraph"/>
-      </w:pPr>
-      <w:r>
-        <w:t xml:space="preserve">The collection and analysis code and the weekly aggregates are available at </w:t>
-      </w:r>
-      <w:r>
-        <w:rPr>
-          <w:highlight w:val="yellow"/>
-        </w:rPr>
-        <w:t xml:space="preserve">[link withheld for review]</w:t>
-      </w:r>
-      <w:r>
-        <w:t xml:space="preserve">.</w:t>
       </w:r>
     </w:p>
     <w:p>

</xml_diff>

<commit_message>
Apply handoff error fixes: release counts, NB wording, hot-fix circularity, RQ3 wording, wild cluster bootstrap
Co-Authored-By: Claude Sonnet 5.5 <noreply@anthropic.com>
Claude-Session: https://claude.ai/code/session_01918kfW6M5XSc3gvpMMKDS3
</commit_message>
<xml_diff>
--- a/paper_data/Manuscript_IEP_revised.docx
+++ b/paper_data/Manuscript_IEP_revised.docx
@@ -5256,7 +5256,7 @@
         <w:t xml:space="preserve">. We use a log link and treat the regression as Poisson quasi-maximum likelihood, which estimates the coefficients consistently as long as the conditional mean is correctly specified, even when the counts are overdispersed (Gourieroux et al. 1984). </w:t>
       </w:r>
       <w:r>
-        <w:t xml:space="preserve">Pearson dispersion statistics (the Pearson chi-square divided by the residual degrees of freedom) are close to one in most repositories (median 0.94, range 0.48 to 1.94) and exceed 1.5 only in Transformers, autogen, semantic-kernel, Ollama, and vLLM. As a robustness check we also fit negative binomial models with the same offset and trend; the pooled age slope from these models is −0.0013 (95% CI −0.009 to 0.007).</w:t>
+        <w:t xml:space="preserve">Pearson dispersion statistics (the Pearson chi-square divided by the residual degrees of freedom) are close to one in most repositories (median 0.94, range 0.48 to 1.94) and exceed 1.5 only in Transformers, autogen, semantic-kernel, Ollama, and vLLM. As a robustness check we also fit negative binomial models with the same offset and trend; the pooled age slope from these models is −0.0013 (95% CI −0.0092 to 0.0067). This is almost the same as the cycle-bootstrap Poisson estimate reported in Section 5.1 (−0.0013; −0.0091 to 0.0066), which is expected when dispersion is close to one; the two were computed separately. Poisson quasi-maximum likelihood with repository-clustered robust standard errors gives −0.0022 (−0.0102 to 0.0057).</w:t>
       </w:r>
     </w:p>
     <w:p>
@@ -5338,7 +5338,7 @@
         <w:t xml:space="preserve">τ²</w:t>
       </w:r>
       <w:r>
-        <w:t xml:space="preserve"> = 0). The estimate is precise enough to rule out, for instance, a 1 percent weekly increase in the bug rate. Eight of the 19 repository-level slopes are positive and 11 are negative. None is significantly positive at the 5 percent level and one (semantic-kernel) is significantly negative, about what chance alone would produce among 19 tests. Negative binomial estimates give a pooled slope of −0.0013 (95% CI −0.009 to 0.007), so the result does not depend on the Poisson variance assumption. H1 is not supported.</w:t>
+        <w:t xml:space="preserve"> = 0). The estimate is precise enough to rule out, for instance, a 1 percent weekly increase in the bug rate. Eight of the 19 repository-level slopes are positive and 11 are negative. None is significantly positive at the 5 percent level and one (semantic-kernel) is significantly negative, about what chance alone would produce among 19 tests. Negative binomial estimates give a pooled slope of −0.0013 (95% CI −0.0092 to 0.0067), nearly identical to the Poisson estimate because dispersion is close to one in most repositories, so the result does not depend on the Poisson variance assumption. H1 is not supported.</w:t>
       </w:r>
     </w:p>
     <w:p>
@@ -5398,7 +5398,7 @@
         <w:t xml:space="preserve"> </w:t>
       </w:r>
       <w:r>
-        <w:t xml:space="preserve">Of the 2,659 releases we collected, 45 percent are classified as hot-fixes, from none in lm-evaluation-harness and FastChat to about three quarters in Ollama and llama_index. The hot-fix hazard is concentrated in the first week after a release: 40 percent of repository-weeks at an age of one week contain a hot-fix, against 5 to 8 percent at ages of two to seven weeks. When age is measured from the last regular release, the repository-level slopes of the regular-release hazard (18 repositories; FastChat has too few regular releases) pool to 0.096 (95% CI −0.006 to 0.198; </w:t>
+        <w:t xml:space="preserve">Of the 2,659 releases in the collected histories (2,456 of them within the weekly panels; the others precede the first panel week), 45 percent are classified as hot-fixes, from none in lm-evaluation-harness and FastChat to about three quarters in Ollama and llama_index. The hot-fix hazard is concentrated in the first week after a release: 40 percent of repository-weeks at an age of one week contain a hot-fix, against 5 to 8 percent at ages of two to seven weeks. Because the seven-day condition places hot-fixes close to the previous release by construction, this concentration is not evidence in itself. Classifying by version number alone, without the seven-day condition, 58 percent of the 2,659 releases raise only the patch component of the previous version, and 77 percent of those appear within seven days of the previous release (median three days). The share of releases that are patch-only falls from 64 percent when the previous release is less than a week old to between 24 and 37 percent when it is five or more weeks old. When age is measured from the last regular release, the repository-level slopes of the regular-release hazard (18 repositories; FastChat has too few regular releases) pool to 0.096 (95% CI −0.006 to 0.198; </w:t>
       </w:r>
       <w:r>
         <w:rPr>
@@ -5408,7 +5408,7 @@
         <w:t xml:space="preserve">τ²</w:t>
       </w:r>
       <w:r>
-        <w:t xml:space="preserve"> = 0.030). Five are significantly positive (diffusers, peft, Transformers, Ollama, and vLLM) and one is significantly negative. In the pooled data, by contrast, the share of repository-weeks with a regular release falls from 0.37 at two weeks to 0.26 at seven weeks, because repositories that release often leave the sample at risk early. This is the dynamic selection described by Heckman and Singer (1984). Within repositories the regular hazard is flat to mildly rising, which is what a fixed cadence implies (Section 3.2).</w:t>
+        <w:t xml:space="preserve"> = 0.030). Five are significantly positive (diffusers, peft, Transformers, Ollama, and vLLM) and one is significantly negative. In the pooled data, by contrast, the share of repository-weeks with a regular release falls from 0.37 at two weeks to 0.26 at seven weeks, because repositories that release often leave the sample at risk early. This is the dynamic selection described by Heckman and Singer (1984). Within repositories the regular hazard is flat to mildly rising, which is what a fixed cadence implies (Section 3.3).</w:t>
       </w:r>
     </w:p>
     <w:p>

</xml_diff>